<commit_message>
docs: handoff audit pass - mark all 5 Phase 3 panels as Built and schema-audited 2026-05-23
</commit_message>
<xml_diff>
--- a/docs/OS3_Command_Centre_Handoff.docx
+++ b/docs/OS3_Command_Centre_Handoff.docx
@@ -4214,7 +4214,7 @@
                 <w:sz w:val="22"/>
                 <w:szCs w:val="22"/>
               </w:rPr>
-              <w:t xml:space="preserve">Placeholder</w:t>
+              <w:t xml:space="preserve">Built (Phase 3) — schema audited 2026-05-23, table currently empty</w:t>
             </w:r>
           </w:p>
         </w:tc>
@@ -4686,7 +4686,7 @@
                 <w:sz w:val="22"/>
                 <w:szCs w:val="22"/>
               </w:rPr>
-              <w:t xml:space="preserve">Placeholder</w:t>
+              <w:t xml:space="preserve">Built (Phase 3) — schema audited 2026-05-23, all columns match</w:t>
             </w:r>
           </w:p>
         </w:tc>
@@ -4804,7 +4804,7 @@
                 <w:sz w:val="22"/>
                 <w:szCs w:val="22"/>
               </w:rPr>
-              <w:t xml:space="preserve">Placeholder</w:t>
+              <w:t xml:space="preserve">Built (Phase 3) — schema audited 2026-05-23, all columns match</w:t>
             </w:r>
           </w:p>
         </w:tc>
@@ -4922,7 +4922,7 @@
                 <w:sz w:val="22"/>
                 <w:szCs w:val="22"/>
               </w:rPr>
-              <w:t xml:space="preserve">Placeholder</w:t>
+              <w:t xml:space="preserve">Built (Phase 3) — schema audited 2026-05-23, all columns match</w:t>
             </w:r>
           </w:p>
         </w:tc>
@@ -5040,7 +5040,7 @@
                 <w:sz w:val="22"/>
                 <w:szCs w:val="22"/>
               </w:rPr>
-              <w:t xml:space="preserve">Placeholder</w:t>
+              <w:t xml:space="preserve">Built (Phase 3) — schema audited 2026-05-23, all columns match</w:t>
             </w:r>
           </w:p>
         </w:tc>
@@ -7494,7 +7494,23 @@
         <w:rPr>
           <w:rFonts w:ascii="Arial" w:cs="Arial" w:eastAsia="Arial" w:hAnsi="Arial"/>
         </w:rPr>
-        <w:t xml:space="preserve">NEXT PRIORITY: Phase 3 panels (/news, /chronicle, /media, /marketing, /whatsapp) are still PlaceholderPage components. All 5 ingest tables are now populated by Kestra — wire each panel to read from its hub_* table using the Phase 2 panel pattern.</w:t>
+        <w:t xml:space="preserve">Phase 3 panels (/news, /chronicle, /media, /marketing, /whatsapp) are already BUILT and schema-audited 2026-05-23. Smoke-test them in production — likely just confirmation needed. Note: /whatsapp will render empty until the WhatsApp Go bridge actually writes rows.</w:t>
+      </w:r>
+    </w:p>
+    <w:p>
+      <w:pPr>
+        <w:pStyle w:val="ListParagraph"/>
+        <w:numPr>
+          <w:ilvl w:val="0"/>
+          <w:numId w:val="3"/>
+        </w:numPr>
+        <w:spacing w:after="80"/>
+      </w:pPr>
+      <w:r>
+        <w:rPr>
+          <w:rFonts w:ascii="Arial" w:cs="Arial" w:eastAsia="Arial" w:hAnsi="Arial"/>
+        </w:rPr>
+        <w:t xml:space="preserve">When the first WhatsApp message lands in hub_whatsapp_messages, immediately run "select distinct direction from hub_whatsapp_messages" — the panel uses ‘in’/‘out’, the Kestra digest uses ‘inbound’/‘outbound’. Patch the loser to match.</w:t>
       </w:r>
     </w:p>
     <w:p>
@@ -8450,7 +8466,23 @@
         <w:rPr>
           <w:rFonts w:ascii="Arial" w:cs="Arial" w:eastAsia="Arial" w:hAnsi="Arial"/>
         </w:rPr>
-        <w:t xml:space="preserve">Wire Phase 3 panels (/news, /chronicle, /media, /marketing, /whatsapp) to their now-populated hub_* tables. Follow the Phase 2 panel pattern: brand-aligned card, header with manual Refresh + last-sync pill, summary strip, error banner, empty/loading/error states.</w:t>
+        <w:t xml:space="preserve">Smoke-test all 5 Phase 3 panels in production (/news, /chronicle, /media, /marketing, /whatsapp). Schemas audited 2026-05-23 — should render cleanly. /whatsapp will show empty state until the Go bridge starts writing.</w:t>
+      </w:r>
+    </w:p>
+    <w:p>
+      <w:pPr>
+        <w:pStyle w:val="ListParagraph"/>
+        <w:numPr>
+          <w:ilvl w:val="0"/>
+          <w:numId w:val="3"/>
+        </w:numPr>
+        <w:spacing w:after="80"/>
+      </w:pPr>
+      <w:r>
+        <w:rPr>
+          <w:rFonts w:ascii="Arial" w:cs="Arial" w:eastAsia="Arial" w:hAnsi="Arial"/>
+        </w:rPr>
+        <w:t xml:space="preserve">Get the WhatsApp Go bridge writing rows into hub_whatsapp_messages. Separate task; depends on the bridge service running.</w:t>
       </w:r>
     </w:p>
     <w:p>

</xml_diff>